<commit_message>
feat(resume): add one-inch photo upload and template export
Add resumes.photo_path with upload/get/delete APIs, render {{@photo}} in Word templates via poi-tl, and document ARK_API_KEY in .env.example.

Co-authored-by: Cursor <cursoragent@cursor.com>
</commit_message>
<xml_diff>
--- a/server/src/main/resources/templates/resumes/academic/template.docx
+++ b/server/src/main/resources/templates/resumes/academic/template.docx
@@ -3,6 +3,14 @@
 <w:document xmlns:wpc="http://schemas.microsoft.com/office/word/2010/wordprocessingCanvas" xmlns:mc="http://schemas.openxmlformats.org/markup-compatibility/2006" xmlns:o="urn:schemas-microsoft-com:office:office" xmlns:r="http://schemas.openxmlformats.org/officeDocument/2006/relationships" xmlns:m="http://schemas.openxmlformats.org/officeDocument/2006/math" xmlns:v="urn:schemas-microsoft-com:vml" xmlns:wp14="http://schemas.microsoft.com/office/word/2010/wordprocessingDrawing" xmlns:wp="http://schemas.openxmlformats.org/drawingml/2006/wordprocessingDrawing" xmlns:w="http://schemas.openxmlformats.org/wordprocessingml/2006/main" xmlns:w14="http://schemas.microsoft.com/office/word/2010/wordml" xmlns:w10="urn:schemas-microsoft-com:office:word" xmlns:w15="http://schemas.microsoft.com/office/word/2012/wordml" xmlns:wpg="http://schemas.microsoft.com/office/word/2010/wordprocessingGroup" xmlns:wpi="http://schemas.microsoft.com/office/word/2010/wordprocessingInk" xmlns:wne="http://schemas.microsoft.com/office/word/2006/wordml" xmlns:wps="http://schemas.microsoft.com/office/word/2010/wordprocessingShape" xmlns:wpsCustomData="http://www.wps.cn/officeDocument/2013/wpsCustomData" mc:Ignorable="w14 w15 wp14">
   <w:background w:color="FFFFFF" w:themeColor="background1"/>
   <w:body>
+    <w:p>
+      <w:pPr>
+        <w:jc w:val="right"/>
+      </w:pPr>
+      <w:r>
+        <w:t>{{@photo}}</w:t>
+      </w:r>
+    </w:p>
     <w:p>
       <w:r>
         <mc:AlternateContent>

</xml_diff>